<commit_message>
docs(HCO v2): MOM policy definitions, SOP fixes, regenerated PDFs
</commit_message>
<xml_diff>
--- a/policies/build/chapters_v2/MOM/Document/MOM_Package/MOM4/SOP_Safe_Prescribing.docx
+++ b/policies/build/chapters_v2/MOM/Document/MOM_Package/MOM4/SOP_Safe_Prescribing.docx
@@ -403,6 +403,14 @@
         <w:spacing w:after="120"/>
       </w:pPr>
       <w:r>
+        <w:t>Common error-prone abbreviations to avoid include "U" for units (misread as a zero, causing a 10-fold overdose), "QD"/"QOD" (mistaken for each other), a trailing zero as in "1.0 mg" (misread as 10 mg), and "MgSO4"/"MSO4" (confused with each other) — see the ISMP List of Error-Prone Abbreviations, Symbols, and Dose Designations (ismp.org).</w:t>
+      </w:r>
+    </w:p>
+    <w:p>
+      <w:pPr>
+        <w:spacing w:after="120"/>
+      </w:pPr>
+      <w:r>
         <w:rPr>
           <w:b/>
           <w:bCs/>

</xml_diff>